<commit_message>
Adjust monster stats, decouple BattleUI.gd, optimize naming, add level2
</commit_message>
<xml_diff>
--- a/自存/项目日志.docx
+++ b/自存/项目日志.docx
@@ -1622,6 +1622,50 @@
         </w:rPr>
         <w:lastRenderedPageBreak/>
         <w:t>了，总之测试版暂且就这样了，产能不足哇！！！</w:t>
+      </w:r>
+    </w:p>
+    <w:p>
+      <w:r>
+        <w:rPr>
+          <w:rFonts w:hint="eastAsia"/>
+        </w:rPr>
+        <w:t>2026.6.26</w:t>
+      </w:r>
+    </w:p>
+    <w:p>
+      <w:r>
+        <w:rPr>
+          <w:rFonts w:hint="eastAsia"/>
+        </w:rPr>
+        <w:t>回来了，先把上次没有修完的bug修掉了，之后改了一些命名的问题</w:t>
+      </w:r>
+    </w:p>
+    <w:p>
+      <w:r>
+        <w:rPr>
+          <w:rFonts w:hint="eastAsia"/>
+        </w:rPr>
+        <w:t>今天的codex思考时间特别久，不知道怎么搞的，token爆炸了，不过现在可以添加关卡了，打算先手动做几关，然后把评分机制SAT系统New TOEFL这些东西都给加进去，不过今天有点晚了等明天好好做一下（但是明天合格考真的有时间做吗）</w:t>
+      </w:r>
+    </w:p>
+    <w:p>
+      <w:r>
+        <w:rPr>
+          <w:rFonts w:hint="eastAsia"/>
+        </w:rPr>
+        <w:t>顺便</w:t>
+      </w:r>
+      <w:r>
+        <w:rPr>
+          <w:rFonts w:hint="eastAsia"/>
+        </w:rPr>
+        <w:t>把冒烟测试都给删了，没啥用还是得我人工查，然后</w:t>
+      </w:r>
+      <w:r>
+        <w:rPr>
+          <w:rFonts w:hint="eastAsia"/>
+        </w:rPr>
+        <w:t>改了一下战斗退出的接线，有一些命名就懒得改了，明天再说</w:t>
       </w:r>
     </w:p>
     <w:sectPr>

</xml_diff>

<commit_message>
Add pre-battle preparation screen
</commit_message>
<xml_diff>
--- a/自存/项目日志.docx
+++ b/自存/项目日志.docx
@@ -1666,6 +1666,51 @@
           <w:rFonts w:hint="eastAsia"/>
         </w:rPr>
         <w:t>改了一下战斗退出的接线，有一些命名就懒得改了，明天再说</w:t>
+      </w:r>
+    </w:p>
+    <w:p>
+      <w:r>
+        <w:rPr>
+          <w:rFonts w:hint="eastAsia"/>
+        </w:rPr>
+        <w:t>2026.6.27</w:t>
+      </w:r>
+    </w:p>
+    <w:p>
+      <w:r>
+        <w:rPr>
+          <w:rFonts w:hint="eastAsia"/>
+        </w:rPr>
+        <w:t>有点懒，还是没有改命名</w:t>
+      </w:r>
+    </w:p>
+    <w:p>
+      <w:r>
+        <w:rPr>
+          <w:rFonts w:hint="eastAsia"/>
+        </w:rPr>
+        <w:t>今天思考了一些关于未来发展方向的问题，目前的机制需要比较多的我方角色才能玩得动，但是角色是不好做的，重合度很容易过高也没什么意思，想想不如删一些机制好了，目前打算把同属性加成给删了，被动挪到战斗开始前选择，三选一这样可能其实更好</w:t>
+      </w:r>
+    </w:p>
+    <w:p>
+      <w:r>
+        <w:rPr>
+          <w:rFonts w:hint="eastAsia"/>
+        </w:rPr>
+        <w:t>于是就去做了战斗前的准备页面，也方便以后拓展了</w:t>
+      </w:r>
+    </w:p>
+    <w:p>
+      <w:pPr>
+        <w:rPr>
+          <w:rFonts w:hint="eastAsia"/>
+        </w:rPr>
+      </w:pPr>
+      <w:r>
+        <w:rPr>
+          <w:rFonts w:hint="eastAsia"/>
+        </w:rPr>
+        <w:t>还有个大头是地下室的设计，我一直有设想但是不知道怎么做，现在感觉爬塔还是挺好玩的，而且可以利用一下AP，在主线我不想让卡牌系统太复杂，这样起不到学习的效果，但在地下室可以复杂起来，通用卡里加入更多AP相关的元素，瞬间组合就多了很多很多，会增添不少游戏性</w:t>
       </w:r>
     </w:p>
     <w:sectPr>

</xml_diff>

<commit_message>
Modify localization and level data, add level 4: S3C3
</commit_message>
<xml_diff>
--- a/自存/项目日志.docx
+++ b/自存/项目日志.docx
@@ -1757,16 +1757,24 @@
       </w:r>
     </w:p>
     <w:p>
-      <w:pPr>
-        <w:rPr>
-          <w:rFonts w:hint="eastAsia"/>
-        </w:rPr>
-      </w:pPr>
       <w:r>
         <w:rPr>
           <w:rFonts w:hint="eastAsia"/>
         </w:rPr>
         <w:t>在此之前先改了一下开发者模式</w:t>
+      </w:r>
+    </w:p>
+    <w:p>
+      <w:pPr>
+        <w:rPr>
+          <w:rFonts w:hint="eastAsia"/>
+        </w:rPr>
+      </w:pPr>
+      <w:r>
+        <w:rPr>
+          <w:rFonts w:hint="eastAsia"/>
+        </w:rPr>
+        <w:t>这个图片生了一天没生出来，倒是先把年兽给做了，年兽引入了蓄力的攻击方式嗯对</w:t>
       </w:r>
     </w:p>
     <w:sectPr>

</xml_diff>

<commit_message>
Adjust monster stats and positions in battle
</commit_message>
<xml_diff>
--- a/自存/项目日志.docx
+++ b/自存/项目日志.docx
@@ -1765,16 +1765,50 @@
       </w:r>
     </w:p>
     <w:p>
-      <w:pPr>
-        <w:rPr>
-          <w:rFonts w:hint="eastAsia"/>
-        </w:rPr>
-      </w:pPr>
       <w:r>
         <w:rPr>
           <w:rFonts w:hint="eastAsia"/>
         </w:rPr>
         <w:t>这个图片生了一天没生出来，倒是先把年兽给做了，年兽引入了蓄力的攻击方式嗯对</w:t>
+      </w:r>
+    </w:p>
+    <w:p/>
+    <w:p>
+      <w:r>
+        <w:rPr>
+          <w:rFonts w:hint="eastAsia"/>
+        </w:rPr>
+        <w:lastRenderedPageBreak/>
+        <w:t>2025.6.29</w:t>
+      </w:r>
+    </w:p>
+    <w:p>
+      <w:r>
+        <w:rPr>
+          <w:rFonts w:hint="eastAsia"/>
+        </w:rPr>
+        <w:t>今天微调了一点东西，现在开始新游戏的时候只会解锁βudding了</w:t>
+      </w:r>
+    </w:p>
+    <w:p>
+      <w:r>
+        <w:rPr>
+          <w:rFonts w:hint="eastAsia"/>
+        </w:rPr>
+        <w:t>除此之外主要去改了一下localization</w:t>
+      </w:r>
+    </w:p>
+    <w:p>
+      <w:pPr>
+        <w:rPr>
+          <w:rFonts w:hint="eastAsia"/>
+        </w:rPr>
+      </w:pPr>
+      <w:r>
+        <w:rPr>
+          <w:rFonts w:hint="eastAsia"/>
+        </w:rPr>
+        <w:t>啊哦现在的话敌方数值有点爆炸了，不过今天不是很有精力，明天再改吧</w:t>
       </w:r>
     </w:p>
     <w:sectPr>

</xml_diff>

<commit_message>
Add single attack to slimes, modify translations.csv
</commit_message>
<xml_diff>
--- a/自存/项目日志.docx
+++ b/自存/项目日志.docx
@@ -1779,7 +1779,19 @@
           <w:rFonts w:hint="eastAsia"/>
         </w:rPr>
         <w:lastRenderedPageBreak/>
-        <w:t>2025.6.29</w:t>
+        <w:t>202</w:t>
+      </w:r>
+      <w:r>
+        <w:rPr>
+          <w:rFonts w:hint="eastAsia"/>
+        </w:rPr>
+        <w:t>6</w:t>
+      </w:r>
+      <w:r>
+        <w:rPr>
+          <w:rFonts w:hint="eastAsia"/>
+        </w:rPr>
+        <w:t>.6.29</w:t>
       </w:r>
     </w:p>
     <w:p>
@@ -1799,16 +1811,32 @@
       </w:r>
     </w:p>
     <w:p>
-      <w:pPr>
-        <w:rPr>
-          <w:rFonts w:hint="eastAsia"/>
-        </w:rPr>
-      </w:pPr>
       <w:r>
         <w:rPr>
           <w:rFonts w:hint="eastAsia"/>
         </w:rPr>
         <w:t>啊哦现在的话敌方数值有点爆炸了，不过今天不是很有精力，明天再改吧</w:t>
+      </w:r>
+    </w:p>
+    <w:p>
+      <w:r>
+        <w:rPr>
+          <w:rFonts w:hint="eastAsia"/>
+        </w:rPr>
+        <w:t>2026.6.30</w:t>
+      </w:r>
+    </w:p>
+    <w:p>
+      <w:pPr>
+        <w:rPr>
+          <w:rFonts w:hint="eastAsia"/>
+        </w:rPr>
+      </w:pPr>
+      <w:r>
+        <w:rPr>
+          <w:rFonts w:hint="eastAsia"/>
+        </w:rPr>
+        <w:t>改了一下敌方数值和站位</w:t>
       </w:r>
     </w:p>
     <w:sectPr>

</xml_diff>